<commit_message>
LaTeX: scale wide tables to the line width; highlights docx generator
Co-Authored-By: Claude Sonnet 5.5 <noreply@anthropic.com>
</commit_message>
<xml_diff>
--- a/Claude outputs/EJOR_highlights.docx
+++ b/Claude outputs/EJOR_highlights.docx
@@ -15,7 +15,7 @@
         <w:pStyle w:val="ListBullet"/>
       </w:pPr>
       <w:r>
-        <w:t>Bi-objective dispersion benchmarked on 443 MDP, CDP and GDP instances</w:t>
+        <w:t>Operators that choose the set size multiply MOEA/D hypervolume on CDP and GDP</w:t>
       </w:r>
     </w:p>
     <w:p>
@@ -39,7 +39,7 @@
         <w:pStyle w:val="ListBullet"/>
       </w:pPr>
       <w:r>
-        <w:t>MOEA/D leads tuned baselines on constrained problems, not on the plain MDP</w:t>
+        <w:t>MOEA/D leads tuned baselines on constrained problems; VNS seeding fixes the MDP</w:t>
       </w:r>
     </w:p>
     <w:p>

</xml_diff>